<commit_message>
Met à jour le planning du samedi (export semaine 1)
39 cours, 156 inscriptions, aucun cours ajouté ni supprimé. La
simulation est levée : Mourad Houmid Bennani reprend ses quatre cours
du Terrain 1 à la place de Felipe Quesney Andrade. VAN DIJK BRUNO
Michele passe du « Vert » de 11:00 à celui de 10:00, et DOMESTICI
Edoardo perd la mention « (COMMUNE) » accolée à son nom.

La fiche de Mourad Houmid Bennani est créée, celle de Felipe Quesney
Andrade supprimée, et neuf autres fiches régénérées.

Co-Authored-By: Claude Opus 5 <noreply@anthropic.com>
Claude-Session: https://claude.ai/code/session_01RsDkbcD3KwyPviDTcs72WZ
</commit_message>
<xml_diff>
--- a/Fiche_Adel_Taieb_2026-2027.docx
+++ b/Fiche_Adel_Taieb_2026-2027.docx
@@ -362,7 +362,7 @@
                 <w:sz w:val="16"/>
                 <w:szCs w:val="16"/>
               </w:rPr>
-              <w:t xml:space="preserve">   2012 · 14.4</w:t>
+              <w:t xml:space="preserve">   2012 · 14.5</w:t>
             </w:r>
           </w:p>
         </w:tc>
@@ -517,7 +517,7 @@
                 <w:sz w:val="16"/>
                 <w:szCs w:val="16"/>
               </w:rPr>
-              <w:t xml:space="preserve">   2010 · 16.2</w:t>
+              <w:t xml:space="preserve">   2010 · 16.3</w:t>
             </w:r>
           </w:p>
         </w:tc>
@@ -670,7 +670,7 @@
                 <w:sz w:val="16"/>
                 <w:szCs w:val="16"/>
               </w:rPr>
-              <w:t xml:space="preserve">   2020 · 6.2</w:t>
+              <w:t xml:space="preserve">   2020 · 6.3</w:t>
             </w:r>
           </w:p>
         </w:tc>
@@ -720,7 +720,7 @@
                 <w:sz w:val="16"/>
                 <w:szCs w:val="16"/>
               </w:rPr>
-              <w:t xml:space="preserve">   2020 · 6</w:t>
+              <w:t xml:space="preserve">   2020 · 6.1</w:t>
             </w:r>
           </w:p>
         </w:tc>
@@ -1133,7 +1133,7 @@
                 <w:sz w:val="16"/>
                 <w:szCs w:val="16"/>
               </w:rPr>
-              <w:t xml:space="preserve">   2019 · 7.2</w:t>
+              <w:t xml:space="preserve">   2019 · 7.3</w:t>
             </w:r>
           </w:p>
         </w:tc>
@@ -1188,7 +1188,7 @@
                 <w:sz w:val="16"/>
                 <w:szCs w:val="16"/>
               </w:rPr>
-              <w:t xml:space="preserve">   2020 · 6</w:t>
+              <w:t xml:space="preserve">   2020 · 6.1</w:t>
             </w:r>
           </w:p>
         </w:tc>
@@ -1238,7 +1238,7 @@
                 <w:sz w:val="16"/>
                 <w:szCs w:val="16"/>
               </w:rPr>
-              <w:t xml:space="preserve">   2018 · 8.4</w:t>
+              <w:t xml:space="preserve">   2018 · 8.5</w:t>
             </w:r>
           </w:p>
         </w:tc>

</xml_diff>